<commit_message>
UPDATED the game name
</commit_message>
<xml_diff>
--- a/docs/MiniGDD.docx
+++ b/docs/MiniGDD.docx
@@ -36,7 +36,7 @@
           <w:sz w:val="24"/>
           <w:szCs w:val="24"/>
         </w:rPr>
-        <w:t>-----</w:t>
+        <w:t>Too Many Faces</w:t>
       </w:r>
       <w:r>
         <w:rPr>
@@ -140,7 +140,7 @@
           <w:sz w:val="22"/>
           <w:szCs w:val="22"/>
         </w:rPr>
-        <w:t>-----</w:t>
+        <w:t>Too Many Faces</w:t>
       </w:r>
       <w:r>
         <w:rPr>

</xml_diff>

<commit_message>
Added my last name :)
</commit_message>
<xml_diff>
--- a/docs/MiniGDD.docx
+++ b/docs/MiniGDD.docx
@@ -106,7 +106,7 @@
           <w:sz w:val="20"/>
           <w:szCs w:val="20"/>
         </w:rPr>
-        <w:t xml:space="preserve">, </w:t>
+        <w:t xml:space="preserve"> Meinhardt</w:t>
       </w:r>
       <w:r>
         <w:rPr>
@@ -115,6 +115,15 @@
           <w:sz w:val="20"/>
           <w:szCs w:val="20"/>
         </w:rPr>
+        <w:t xml:space="preserve">, </w:t>
+      </w:r>
+      <w:r>
+        <w:rPr>
+          <w:rFonts w:ascii="Times New Roman" w:hAnsi="Times New Roman"/>
+          <w:color w:val="0E2841" w:themeColor="text2"/>
+          <w:sz w:val="20"/>
+          <w:szCs w:val="20"/>
+        </w:rPr>
         <w:t>Reyyan Pak,</w:t>
       </w:r>
     </w:p>
@@ -128,67 +137,17 @@
     </w:p>
     <w:p>
       <w:pPr>
-        <w:pStyle w:val="Balk1"/>
-        <w:rPr>
-          <w:rFonts w:ascii="Times New Roman" w:hAnsi="Times New Roman"/>
-        </w:rPr>
-      </w:pPr>
-      <w:r>
-        <w:rPr>
-          <w:rFonts w:ascii="Times New Roman" w:hAnsi="Times New Roman"/>
-        </w:rPr>
-        <w:t xml:space="preserve">1. </w:t>
-      </w:r>
-      <w:proofErr w:type="spellStart"/>
-      <w:r>
-        <w:rPr>
-          <w:rFonts w:ascii="Times New Roman" w:hAnsi="Times New Roman"/>
-        </w:rPr>
-        <w:t>Concept</w:t>
-      </w:r>
-      <w:proofErr w:type="spellEnd"/>
-      <w:r>
-        <w:rPr>
-          <w:rFonts w:ascii="Times New Roman" w:hAnsi="Times New Roman"/>
-        </w:rPr>
-        <w:t xml:space="preserve">, </w:t>
-      </w:r>
-      <w:proofErr w:type="spellStart"/>
-      <w:r>
-        <w:rPr>
-          <w:rFonts w:ascii="Times New Roman" w:hAnsi="Times New Roman"/>
-        </w:rPr>
-        <w:t>Goal</w:t>
-      </w:r>
-      <w:proofErr w:type="spellEnd"/>
-      <w:r>
-        <w:rPr>
-          <w:rFonts w:ascii="Times New Roman" w:hAnsi="Times New Roman"/>
-        </w:rPr>
-        <w:t xml:space="preserve"> </w:t>
-      </w:r>
-      <w:proofErr w:type="spellStart"/>
-      <w:r>
-        <w:rPr>
-          <w:rFonts w:ascii="Times New Roman" w:hAnsi="Times New Roman"/>
-        </w:rPr>
-        <w:t>and</w:t>
-      </w:r>
-      <w:proofErr w:type="spellEnd"/>
-      <w:r>
-        <w:rPr>
-          <w:rFonts w:ascii="Times New Roman" w:hAnsi="Times New Roman"/>
-        </w:rPr>
-        <w:t xml:space="preserve"> </w:t>
-      </w:r>
-      <w:proofErr w:type="spellStart"/>
-      <w:r>
-        <w:rPr>
-          <w:rFonts w:ascii="Times New Roman" w:hAnsi="Times New Roman"/>
-        </w:rPr>
-        <w:t>Scope</w:t>
-      </w:r>
-      <w:proofErr w:type="spellEnd"/>
+        <w:pStyle w:val="berschrift1"/>
+        <w:rPr>
+          <w:rFonts w:ascii="Times New Roman" w:hAnsi="Times New Roman"/>
+        </w:rPr>
+      </w:pPr>
+      <w:r>
+        <w:rPr>
+          <w:rFonts w:ascii="Times New Roman" w:hAnsi="Times New Roman"/>
+        </w:rPr>
+        <w:t>1. Concept, Goal and Scope</w:t>
+      </w:r>
     </w:p>
     <w:p>
       <w:pPr>
@@ -217,25 +176,17 @@
     </w:p>
     <w:p>
       <w:pPr>
-        <w:pStyle w:val="Balk2"/>
-        <w:rPr>
-          <w:rFonts w:ascii="Times New Roman" w:hAnsi="Times New Roman"/>
-        </w:rPr>
-      </w:pPr>
-      <w:r>
-        <w:rPr>
-          <w:rFonts w:ascii="Times New Roman" w:hAnsi="Times New Roman"/>
-        </w:rPr>
-        <w:t xml:space="preserve">1.1 </w:t>
-      </w:r>
-      <w:proofErr w:type="spellStart"/>
-      <w:r>
-        <w:rPr>
-          <w:rFonts w:ascii="Times New Roman" w:hAnsi="Times New Roman"/>
-        </w:rPr>
-        <w:t>Objective</w:t>
-      </w:r>
-      <w:proofErr w:type="spellEnd"/>
+        <w:pStyle w:val="berschrift2"/>
+        <w:rPr>
+          <w:rFonts w:ascii="Times New Roman" w:hAnsi="Times New Roman"/>
+        </w:rPr>
+      </w:pPr>
+      <w:r>
+        <w:rPr>
+          <w:rFonts w:ascii="Times New Roman" w:hAnsi="Times New Roman"/>
+        </w:rPr>
+        <w:t>1.1 Objective</w:t>
+      </w:r>
     </w:p>
     <w:p>
       <w:pPr>
@@ -256,7 +207,7 @@
     </w:p>
     <w:p>
       <w:pPr>
-        <w:pStyle w:val="Balk2"/>
+        <w:pStyle w:val="berschrift2"/>
         <w:rPr>
           <w:rFonts w:ascii="Times New Roman" w:hAnsi="Times New Roman"/>
           <w:noProof/>
@@ -338,7 +289,7 @@
     </w:p>
     <w:p>
       <w:pPr>
-        <w:pStyle w:val="Balk2"/>
+        <w:pStyle w:val="berschrift2"/>
         <w:rPr>
           <w:rFonts w:ascii="Times New Roman" w:hAnsi="Times New Roman"/>
           <w:noProof/>
@@ -371,7 +322,7 @@
     </w:p>
     <w:p>
       <w:pPr>
-        <w:pStyle w:val="Balk2"/>
+        <w:pStyle w:val="berschrift2"/>
         <w:rPr>
           <w:rFonts w:ascii="Times New Roman" w:hAnsi="Times New Roman"/>
           <w:noProof/>
@@ -430,7 +381,7 @@
     </w:p>
     <w:p>
       <w:pPr>
-        <w:pStyle w:val="Balk1"/>
+        <w:pStyle w:val="berschrift1"/>
         <w:rPr>
           <w:rFonts w:ascii="Times New Roman" w:hAnsi="Times New Roman"/>
           <w:noProof/>
@@ -447,7 +398,7 @@
     </w:p>
     <w:p>
       <w:pPr>
-        <w:pStyle w:val="Balk2"/>
+        <w:pStyle w:val="berschrift2"/>
         <w:rPr>
           <w:rFonts w:ascii="Times New Roman" w:hAnsi="Times New Roman"/>
           <w:noProof/>
@@ -506,7 +457,7 @@
     </w:p>
     <w:p>
       <w:pPr>
-        <w:pStyle w:val="Balk2"/>
+        <w:pStyle w:val="berschrift2"/>
         <w:rPr>
           <w:rFonts w:ascii="Times New Roman" w:hAnsi="Times New Roman"/>
           <w:noProof/>
@@ -539,7 +490,7 @@
     </w:p>
     <w:tbl>
       <w:tblPr>
-        <w:tblStyle w:val="TabloKlavuzu"/>
+        <w:tblStyle w:val="Tabellenraster"/>
         <w:tblW w:w="5000" w:type="pct"/>
         <w:tblInd w:w="5" w:type="dxa"/>
         <w:tblBorders>
@@ -960,7 +911,7 @@
     </w:p>
     <w:p>
       <w:pPr>
-        <w:pStyle w:val="Balk2"/>
+        <w:pStyle w:val="berschrift2"/>
         <w:rPr>
           <w:rFonts w:ascii="Times New Roman" w:hAnsi="Times New Roman"/>
           <w:noProof/>
@@ -1068,7 +1019,7 @@
     </w:p>
     <w:p>
       <w:pPr>
-        <w:pStyle w:val="Balk2"/>
+        <w:pStyle w:val="berschrift2"/>
         <w:rPr>
           <w:rFonts w:ascii="Times New Roman" w:hAnsi="Times New Roman"/>
           <w:noProof/>
@@ -1101,7 +1052,7 @@
     </w:p>
     <w:tbl>
       <w:tblPr>
-        <w:tblStyle w:val="TabloKlavuzu"/>
+        <w:tblStyle w:val="Tabellenraster"/>
         <w:tblW w:w="5000" w:type="pct"/>
         <w:tblInd w:w="5" w:type="dxa"/>
         <w:tblBorders>
@@ -1747,7 +1698,7 @@
     </w:p>
     <w:p>
       <w:pPr>
-        <w:pStyle w:val="Balk2"/>
+        <w:pStyle w:val="berschrift2"/>
         <w:rPr>
           <w:rFonts w:ascii="Times New Roman" w:hAnsi="Times New Roman"/>
           <w:noProof/>
@@ -1838,7 +1789,7 @@
     </w:p>
     <w:p>
       <w:pPr>
-        <w:pStyle w:val="Balk2"/>
+        <w:pStyle w:val="berschrift2"/>
         <w:rPr>
           <w:rFonts w:ascii="Times New Roman" w:hAnsi="Times New Roman"/>
           <w:noProof/>
@@ -1871,7 +1822,7 @@
     </w:p>
     <w:p>
       <w:pPr>
-        <w:pStyle w:val="ListeParagraf"/>
+        <w:pStyle w:val="Listenabsatz"/>
         <w:rPr>
           <w:rFonts w:ascii="Times New Roman" w:hAnsi="Times New Roman"/>
           <w:noProof/>
@@ -1909,7 +1860,7 @@
     </w:p>
     <w:p>
       <w:pPr>
-        <w:pStyle w:val="ListeParagraf"/>
+        <w:pStyle w:val="Listenabsatz"/>
         <w:rPr>
           <w:rFonts w:ascii="Times New Roman" w:hAnsi="Times New Roman"/>
           <w:noProof/>
@@ -1947,7 +1898,7 @@
     </w:p>
     <w:p>
       <w:pPr>
-        <w:pStyle w:val="ListeParagraf"/>
+        <w:pStyle w:val="Listenabsatz"/>
         <w:rPr>
           <w:rFonts w:ascii="Times New Roman" w:hAnsi="Times New Roman"/>
           <w:noProof/>
@@ -1985,7 +1936,7 @@
     </w:p>
     <w:p>
       <w:pPr>
-        <w:pStyle w:val="ListeParagraf"/>
+        <w:pStyle w:val="Listenabsatz"/>
         <w:rPr>
           <w:rFonts w:ascii="Times New Roman" w:hAnsi="Times New Roman"/>
           <w:noProof/>
@@ -2023,18 +1974,18 @@
     </w:p>
     <w:p>
       <w:pPr>
-        <w:pStyle w:val="ListeParagraf"/>
-        <w:rPr>
-          <w:rFonts w:ascii="Times New Roman" w:hAnsi="Times New Roman"/>
-          <w:noProof/>
-          <w:sz w:val="22"/>
-          <w:szCs w:val="22"/>
-        </w:rPr>
-      </w:pPr>
-    </w:p>
-    <w:p>
-      <w:pPr>
-        <w:pStyle w:val="Balk2"/>
+        <w:pStyle w:val="Listenabsatz"/>
+        <w:rPr>
+          <w:rFonts w:ascii="Times New Roman" w:hAnsi="Times New Roman"/>
+          <w:noProof/>
+          <w:sz w:val="22"/>
+          <w:szCs w:val="22"/>
+        </w:rPr>
+      </w:pPr>
+    </w:p>
+    <w:p>
+      <w:pPr>
+        <w:pStyle w:val="berschrift2"/>
         <w:rPr>
           <w:rFonts w:ascii="Times New Roman" w:hAnsi="Times New Roman"/>
           <w:noProof/>
@@ -2108,7 +2059,7 @@
     </w:p>
     <w:p>
       <w:pPr>
-        <w:pStyle w:val="Balk1"/>
+        <w:pStyle w:val="berschrift1"/>
         <w:rPr>
           <w:rFonts w:ascii="Times New Roman" w:hAnsi="Times New Roman"/>
           <w:noProof/>
@@ -2172,7 +2123,7 @@
       <w:hyperlink r:id="rId4" w:anchor="sex=male&amp;body=Body_Color_light&amp;head=Human_Male_light&amp;expression=Neutral_light&amp;shadow=Shadow_brow" w:history="1">
         <w:r>
           <w:rPr>
-            <w:rStyle w:val="Kpr"/>
+            <w:rStyle w:val="Hyperlink"/>
             <w:rFonts w:ascii="Times New Roman" w:hAnsi="Times New Roman"/>
             <w:sz w:val="22"/>
             <w:szCs w:val="22"/>
@@ -2233,7 +2184,7 @@
       <w:hyperlink r:id="rId5" w:tgtFrame="_blank" w:history="1">
         <w:r>
           <w:rPr>
-            <w:rStyle w:val="Kpr"/>
+            <w:rStyle w:val="Hyperlink"/>
             <w:rFonts w:ascii="Times New Roman" w:hAnsi="Times New Roman"/>
             <w:sz w:val="22"/>
             <w:szCs w:val="22"/>
@@ -2275,7 +2226,7 @@
       <w:hyperlink r:id="rId6" w:tgtFrame="_blank" w:history="1">
         <w:r>
           <w:rPr>
-            <w:rStyle w:val="Kpr"/>
+            <w:rStyle w:val="Hyperlink"/>
             <w:rFonts w:ascii="Times New Roman" w:hAnsi="Times New Roman"/>
             <w:sz w:val="22"/>
             <w:szCs w:val="22"/>
@@ -2317,7 +2268,7 @@
       <w:hyperlink r:id="rId7" w:tgtFrame="_blank" w:history="1">
         <w:r>
           <w:rPr>
-            <w:rStyle w:val="Kpr"/>
+            <w:rStyle w:val="Hyperlink"/>
             <w:rFonts w:ascii="Times New Roman" w:hAnsi="Times New Roman"/>
             <w:sz w:val="22"/>
             <w:szCs w:val="22"/>
@@ -2359,7 +2310,7 @@
       <w:hyperlink r:id="rId8" w:tgtFrame="_blank" w:history="1">
         <w:r>
           <w:rPr>
-            <w:rStyle w:val="Kpr"/>
+            <w:rStyle w:val="Hyperlink"/>
             <w:rFonts w:ascii="Times New Roman" w:hAnsi="Times New Roman"/>
             <w:sz w:val="22"/>
             <w:szCs w:val="22"/>
@@ -2401,7 +2352,7 @@
       <w:hyperlink r:id="rId9" w:tgtFrame="_blank" w:history="1">
         <w:r>
           <w:rPr>
-            <w:rStyle w:val="Kpr"/>
+            <w:rStyle w:val="Hyperlink"/>
             <w:rFonts w:ascii="Times New Roman" w:hAnsi="Times New Roman"/>
             <w:sz w:val="22"/>
             <w:szCs w:val="22"/>
@@ -2443,7 +2394,7 @@
       <w:hyperlink r:id="rId10" w:tgtFrame="_blank" w:history="1">
         <w:r>
           <w:rPr>
-            <w:rStyle w:val="Kpr"/>
+            <w:rStyle w:val="Hyperlink"/>
             <w:rFonts w:ascii="Times New Roman" w:hAnsi="Times New Roman"/>
             <w:sz w:val="22"/>
             <w:szCs w:val="22"/>
@@ -2485,7 +2436,7 @@
       <w:hyperlink r:id="rId11" w:tgtFrame="_blank" w:history="1">
         <w:r>
           <w:rPr>
-            <w:rStyle w:val="Kpr"/>
+            <w:rStyle w:val="Hyperlink"/>
             <w:rFonts w:ascii="Times New Roman" w:hAnsi="Times New Roman"/>
             <w:sz w:val="22"/>
             <w:szCs w:val="22"/>
@@ -2527,7 +2478,7 @@
       <w:hyperlink r:id="rId12" w:history="1">
         <w:r>
           <w:rPr>
-            <w:rStyle w:val="Kpr"/>
+            <w:rStyle w:val="Hyperlink"/>
             <w:rFonts w:ascii="Times New Roman" w:hAnsi="Times New Roman"/>
             <w:sz w:val="22"/>
             <w:szCs w:val="22"/>
@@ -2569,7 +2520,7 @@
       <w:hyperlink r:id="rId13" w:tgtFrame="_blank" w:history="1">
         <w:r>
           <w:rPr>
-            <w:rStyle w:val="Kpr"/>
+            <w:rStyle w:val="Hyperlink"/>
             <w:rFonts w:ascii="Times New Roman" w:hAnsi="Times New Roman"/>
             <w:sz w:val="22"/>
             <w:szCs w:val="22"/>
@@ -2611,7 +2562,7 @@
       <w:hyperlink r:id="rId14" w:tgtFrame="_blank" w:history="1">
         <w:r>
           <w:rPr>
-            <w:rStyle w:val="Kpr"/>
+            <w:rStyle w:val="Hyperlink"/>
             <w:rFonts w:ascii="Times New Roman" w:hAnsi="Times New Roman"/>
             <w:sz w:val="22"/>
             <w:szCs w:val="22"/>
@@ -2653,7 +2604,7 @@
       <w:hyperlink r:id="rId15" w:tgtFrame="_blank" w:history="1">
         <w:r>
           <w:rPr>
-            <w:rStyle w:val="Kpr"/>
+            <w:rStyle w:val="Hyperlink"/>
             <w:rFonts w:ascii="Times New Roman" w:hAnsi="Times New Roman"/>
             <w:sz w:val="22"/>
             <w:szCs w:val="22"/>
@@ -2667,9 +2618,9 @@
       <w:pPr>
         <w:rPr>
           <w:rFonts w:ascii="Times New Roman" w:hAnsi="Times New Roman"/>
-          <w:sz w:val="22"/>
-          <w:szCs w:val="22"/>
-          <w:lang w:val="de-DE"/>
+          <w:color w:val="0E2841" w:themeColor="text2"/>
+          <w:sz w:val="20"/>
+          <w:szCs w:val="20"/>
         </w:rPr>
       </w:pPr>
       <w:r>
@@ -2695,7 +2646,7 @@
       <w:hyperlink r:id="rId16" w:tgtFrame="_blank" w:history="1">
         <w:r>
           <w:rPr>
-            <w:rStyle w:val="Kpr"/>
+            <w:rStyle w:val="Hyperlink"/>
             <w:rFonts w:ascii="Times New Roman" w:hAnsi="Times New Roman"/>
             <w:sz w:val="22"/>
             <w:szCs w:val="22"/>
@@ -2704,6 +2655,70 @@
           <w:t>https://arlantr.itch.io/free-office-pixel-art</w:t>
         </w:r>
       </w:hyperlink>
+      <w:r>
+        <w:rPr>
+          <w:rFonts w:ascii="Times New Roman" w:hAnsi="Times New Roman"/>
+          <w:color w:val="0E2841" w:themeColor="text2"/>
+          <w:sz w:val="20"/>
+          <w:szCs w:val="20"/>
+        </w:rPr>
+        <w:t xml:space="preserve"> </w:t>
+      </w:r>
+    </w:p>
+    <w:p>
+      <w:pPr>
+        <w:rPr>
+          <w:rFonts w:ascii="Times New Roman" w:hAnsi="Times New Roman"/>
+          <w:sz w:val="22"/>
+          <w:szCs w:val="22"/>
+          <w:lang w:val="de-DE"/>
+        </w:rPr>
+      </w:pPr>
+      <w:r>
+        <w:rPr>
+          <w:rFonts w:ascii="Times New Roman" w:hAnsi="Times New Roman"/>
+          <w:b/>
+          <w:bCs/>
+          <w:sz w:val="22"/>
+          <w:szCs w:val="22"/>
+          <w:lang w:val="en-US"/>
+        </w:rPr>
+        <w:t>Music</w:t>
+      </w:r>
+      <w:r>
+        <w:rPr>
+          <w:rFonts w:ascii="Times New Roman" w:hAnsi="Times New Roman"/>
+          <w:b/>
+          <w:bCs/>
+          <w:sz w:val="22"/>
+          <w:szCs w:val="22"/>
+          <w:lang w:val="en-US"/>
+        </w:rPr>
+        <w:t xml:space="preserve">: </w:t>
+      </w:r>
+      <w:hyperlink r:id="rId17" w:history="1">
+        <w:r>
+          <w:rPr>
+            <w:rStyle w:val="Hyperlink"/>
+            <w:rFonts w:ascii="Times New Roman" w:hAnsi="Times New Roman"/>
+            <w:sz w:val="22"/>
+            <w:szCs w:val="22"/>
+            <w:lang w:val="en-US"/>
+          </w:rPr>
+          <w:t>https://incompetech.com/music/royalty-free/music.html</w:t>
+        </w:r>
+      </w:hyperlink>
+      <w:r>
+        <w:rPr>
+          <w:rFonts w:ascii="Times New Roman" w:hAnsi="Times New Roman"/>
+          <w:b/>
+          <w:bCs/>
+          <w:sz w:val="22"/>
+          <w:szCs w:val="22"/>
+          <w:lang w:val="en-US"/>
+        </w:rPr>
+        <w:t xml:space="preserve"> </w:t>
+      </w:r>
     </w:p>
     <w:sectPr>
       <w:pgSz w:w="11906" w:h="16838"/>
@@ -3109,14 +3124,14 @@
     <w:lsdException w:name="Unresolved Mention" w:semiHidden="1" w:unhideWhenUsed="1"/>
     <w:lsdException w:name="Smart Link" w:semiHidden="1" w:unhideWhenUsed="1"/>
   </w:latentStyles>
-  <w:style w:type="paragraph" w:default="1" w:styleId="Normal">
+  <w:style w:type="paragraph" w:default="1" w:styleId="Standard">
     <w:name w:val="Normal"/>
     <w:qFormat/>
     <w:rPr>
       <w:noProof/>
     </w:rPr>
   </w:style>
-  <w:style w:type="paragraph" w:styleId="Balk1">
+  <w:style w:type="paragraph" w:styleId="berschrift1">
     <w:name w:val="heading 1"/>
     <w:uiPriority w:val="9"/>
     <w:qFormat/>
@@ -3132,7 +3147,7 @@
       <w:szCs w:val="30"/>
     </w:rPr>
   </w:style>
-  <w:style w:type="paragraph" w:styleId="Balk2">
+  <w:style w:type="paragraph" w:styleId="berschrift2">
     <w:name w:val="heading 2"/>
     <w:uiPriority w:val="9"/>
     <w:unhideWhenUsed/>
@@ -3149,13 +3164,13 @@
       <w:szCs w:val="24"/>
     </w:rPr>
   </w:style>
-  <w:style w:type="character" w:default="1" w:styleId="VarsaylanParagrafYazTipi">
+  <w:style w:type="character" w:default="1" w:styleId="Absatz-Standardschriftart">
     <w:name w:val="Default Paragraph Font"/>
     <w:uiPriority w:val="1"/>
     <w:semiHidden/>
     <w:unhideWhenUsed/>
   </w:style>
-  <w:style w:type="table" w:default="1" w:styleId="NormalTablo">
+  <w:style w:type="table" w:default="1" w:styleId="NormaleTabelle">
     <w:name w:val="Normal Table"/>
     <w:uiPriority w:val="99"/>
     <w:semiHidden/>
@@ -3170,20 +3185,20 @@
       </w:tblCellMar>
     </w:tblPr>
   </w:style>
-  <w:style w:type="numbering" w:default="1" w:styleId="ListeYok">
+  <w:style w:type="numbering" w:default="1" w:styleId="KeineListe">
     <w:name w:val="No List"/>
     <w:uiPriority w:val="99"/>
     <w:semiHidden/>
     <w:unhideWhenUsed/>
   </w:style>
-  <w:style w:type="paragraph" w:styleId="ListeParagraf">
+  <w:style w:type="paragraph" w:styleId="Listenabsatz">
     <w:name w:val="List Paragraph"/>
     <w:pPr>
       <w:spacing w:after="60"/>
       <w:ind w:left="284"/>
     </w:pPr>
   </w:style>
-  <w:style w:type="table" w:styleId="TabloKlavuzu">
+  <w:style w:type="table" w:styleId="Tabellenraster">
     <w:name w:val="Table Grid"/>
     <w:tblPr>
       <w:tblCellMar>
@@ -3194,9 +3209,9 @@
       </w:tblCellMar>
     </w:tblPr>
   </w:style>
-  <w:style w:type="character" w:styleId="Kpr">
+  <w:style w:type="character" w:styleId="Hyperlink">
     <w:name w:val="Hyperlink"/>
-    <w:basedOn w:val="VarsaylanParagrafYazTipi"/>
+    <w:basedOn w:val="Absatz-Standardschriftart"/>
     <w:uiPriority w:val="99"/>
     <w:unhideWhenUsed/>
     <w:rsid w:val="00442BF3"/>
@@ -3205,9 +3220,9 @@
       <w:u w:val="single"/>
     </w:rPr>
   </w:style>
-  <w:style w:type="character" w:styleId="zmlenmeyenBahsetme">
+  <w:style w:type="character" w:styleId="NichtaufgelsteErwhnung">
     <w:name w:val="Unresolved Mention"/>
-    <w:basedOn w:val="VarsaylanParagrafYazTipi"/>
+    <w:basedOn w:val="Absatz-Standardschriftart"/>
     <w:uiPriority w:val="99"/>
     <w:semiHidden/>
     <w:unhideWhenUsed/>

</xml_diff>

<commit_message>
ADDED seated player catching
Also updated mini gdd with tv sound asset
</commit_message>
<xml_diff>
--- a/docs/MiniGDD.docx
+++ b/docs/MiniGDD.docx
@@ -137,7 +137,7 @@
     </w:p>
     <w:p>
       <w:pPr>
-        <w:pStyle w:val="berschrift1"/>
+        <w:pStyle w:val="Heading1"/>
         <w:rPr>
           <w:rFonts w:ascii="Times New Roman" w:hAnsi="Times New Roman"/>
         </w:rPr>
@@ -176,7 +176,7 @@
     </w:p>
     <w:p>
       <w:pPr>
-        <w:pStyle w:val="berschrift2"/>
+        <w:pStyle w:val="Heading2"/>
         <w:rPr>
           <w:rFonts w:ascii="Times New Roman" w:hAnsi="Times New Roman"/>
         </w:rPr>
@@ -207,7 +207,7 @@
     </w:p>
     <w:p>
       <w:pPr>
-        <w:pStyle w:val="berschrift2"/>
+        <w:pStyle w:val="Heading2"/>
         <w:rPr>
           <w:rFonts w:ascii="Times New Roman" w:hAnsi="Times New Roman"/>
           <w:noProof/>
@@ -289,7 +289,7 @@
     </w:p>
     <w:p>
       <w:pPr>
-        <w:pStyle w:val="berschrift2"/>
+        <w:pStyle w:val="Heading2"/>
         <w:rPr>
           <w:rFonts w:ascii="Times New Roman" w:hAnsi="Times New Roman"/>
           <w:noProof/>
@@ -322,7 +322,7 @@
     </w:p>
     <w:p>
       <w:pPr>
-        <w:pStyle w:val="berschrift2"/>
+        <w:pStyle w:val="Heading2"/>
         <w:rPr>
           <w:rFonts w:ascii="Times New Roman" w:hAnsi="Times New Roman"/>
           <w:noProof/>
@@ -381,7 +381,7 @@
     </w:p>
     <w:p>
       <w:pPr>
-        <w:pStyle w:val="berschrift1"/>
+        <w:pStyle w:val="Heading1"/>
         <w:rPr>
           <w:rFonts w:ascii="Times New Roman" w:hAnsi="Times New Roman"/>
           <w:noProof/>
@@ -398,7 +398,7 @@
     </w:p>
     <w:p>
       <w:pPr>
-        <w:pStyle w:val="berschrift2"/>
+        <w:pStyle w:val="Heading2"/>
         <w:rPr>
           <w:rFonts w:ascii="Times New Roman" w:hAnsi="Times New Roman"/>
           <w:noProof/>
@@ -457,7 +457,7 @@
     </w:p>
     <w:p>
       <w:pPr>
-        <w:pStyle w:val="berschrift2"/>
+        <w:pStyle w:val="Heading2"/>
         <w:rPr>
           <w:rFonts w:ascii="Times New Roman" w:hAnsi="Times New Roman"/>
           <w:noProof/>
@@ -490,7 +490,7 @@
     </w:p>
     <w:tbl>
       <w:tblPr>
-        <w:tblStyle w:val="Tabellenraster"/>
+        <w:tblStyle w:val="TableGrid"/>
         <w:tblW w:w="5000" w:type="pct"/>
         <w:tblInd w:w="5" w:type="dxa"/>
         <w:tblBorders>
@@ -911,7 +911,7 @@
     </w:p>
     <w:p>
       <w:pPr>
-        <w:pStyle w:val="berschrift2"/>
+        <w:pStyle w:val="Heading2"/>
         <w:rPr>
           <w:rFonts w:ascii="Times New Roman" w:hAnsi="Times New Roman"/>
           <w:noProof/>
@@ -1019,7 +1019,7 @@
     </w:p>
     <w:p>
       <w:pPr>
-        <w:pStyle w:val="berschrift2"/>
+        <w:pStyle w:val="Heading2"/>
         <w:rPr>
           <w:rFonts w:ascii="Times New Roman" w:hAnsi="Times New Roman"/>
           <w:noProof/>
@@ -1052,7 +1052,7 @@
     </w:p>
     <w:tbl>
       <w:tblPr>
-        <w:tblStyle w:val="Tabellenraster"/>
+        <w:tblStyle w:val="TableGrid"/>
         <w:tblW w:w="5000" w:type="pct"/>
         <w:tblInd w:w="5" w:type="dxa"/>
         <w:tblBorders>
@@ -1698,7 +1698,7 @@
     </w:p>
     <w:p>
       <w:pPr>
-        <w:pStyle w:val="berschrift2"/>
+        <w:pStyle w:val="Heading2"/>
         <w:rPr>
           <w:rFonts w:ascii="Times New Roman" w:hAnsi="Times New Roman"/>
           <w:noProof/>
@@ -1789,7 +1789,7 @@
     </w:p>
     <w:p>
       <w:pPr>
-        <w:pStyle w:val="berschrift2"/>
+        <w:pStyle w:val="Heading2"/>
         <w:rPr>
           <w:rFonts w:ascii="Times New Roman" w:hAnsi="Times New Roman"/>
           <w:noProof/>
@@ -1822,7 +1822,7 @@
     </w:p>
     <w:p>
       <w:pPr>
-        <w:pStyle w:val="Listenabsatz"/>
+        <w:pStyle w:val="ListParagraph"/>
         <w:rPr>
           <w:rFonts w:ascii="Times New Roman" w:hAnsi="Times New Roman"/>
           <w:noProof/>
@@ -1860,7 +1860,7 @@
     </w:p>
     <w:p>
       <w:pPr>
-        <w:pStyle w:val="Listenabsatz"/>
+        <w:pStyle w:val="ListParagraph"/>
         <w:rPr>
           <w:rFonts w:ascii="Times New Roman" w:hAnsi="Times New Roman"/>
           <w:noProof/>
@@ -1898,7 +1898,7 @@
     </w:p>
     <w:p>
       <w:pPr>
-        <w:pStyle w:val="Listenabsatz"/>
+        <w:pStyle w:val="ListParagraph"/>
         <w:rPr>
           <w:rFonts w:ascii="Times New Roman" w:hAnsi="Times New Roman"/>
           <w:noProof/>
@@ -1936,7 +1936,7 @@
     </w:p>
     <w:p>
       <w:pPr>
-        <w:pStyle w:val="Listenabsatz"/>
+        <w:pStyle w:val="ListParagraph"/>
         <w:rPr>
           <w:rFonts w:ascii="Times New Roman" w:hAnsi="Times New Roman"/>
           <w:noProof/>
@@ -1974,18 +1974,18 @@
     </w:p>
     <w:p>
       <w:pPr>
-        <w:pStyle w:val="Listenabsatz"/>
-        <w:rPr>
-          <w:rFonts w:ascii="Times New Roman" w:hAnsi="Times New Roman"/>
-          <w:noProof/>
-          <w:sz w:val="22"/>
-          <w:szCs w:val="22"/>
-        </w:rPr>
-      </w:pPr>
-    </w:p>
-    <w:p>
-      <w:pPr>
-        <w:pStyle w:val="berschrift2"/>
+        <w:pStyle w:val="ListParagraph"/>
+        <w:rPr>
+          <w:rFonts w:ascii="Times New Roman" w:hAnsi="Times New Roman"/>
+          <w:noProof/>
+          <w:sz w:val="22"/>
+          <w:szCs w:val="22"/>
+        </w:rPr>
+      </w:pPr>
+    </w:p>
+    <w:p>
+      <w:pPr>
+        <w:pStyle w:val="Heading2"/>
         <w:rPr>
           <w:rFonts w:ascii="Times New Roman" w:hAnsi="Times New Roman"/>
           <w:noProof/>
@@ -2059,7 +2059,7 @@
     </w:p>
     <w:p>
       <w:pPr>
-        <w:pStyle w:val="berschrift1"/>
+        <w:pStyle w:val="Heading1"/>
         <w:rPr>
           <w:rFonts w:ascii="Times New Roman" w:hAnsi="Times New Roman"/>
           <w:noProof/>
@@ -2669,9 +2669,11 @@
       <w:pPr>
         <w:rPr>
           <w:rFonts w:ascii="Times New Roman" w:hAnsi="Times New Roman"/>
-          <w:sz w:val="22"/>
-          <w:szCs w:val="22"/>
-          <w:lang w:val="de-DE"/>
+          <w:b/>
+          <w:bCs/>
+          <w:sz w:val="22"/>
+          <w:szCs w:val="22"/>
+          <w:lang w:val="en-US"/>
         </w:rPr>
       </w:pPr>
       <w:r>
@@ -2719,6 +2721,50 @@
         </w:rPr>
         <w:t xml:space="preserve"> </w:t>
       </w:r>
+      <w:r>
+        <w:rPr>
+          <w:rFonts w:ascii="Times New Roman" w:hAnsi="Times New Roman"/>
+          <w:b/>
+          <w:bCs/>
+          <w:sz w:val="22"/>
+          <w:szCs w:val="22"/>
+          <w:lang w:val="en-US"/>
+        </w:rPr>
+        <w:t xml:space="preserve"> </w:t>
+      </w:r>
+    </w:p>
+    <w:p>
+      <w:pPr>
+        <w:rPr>
+          <w:rFonts w:ascii="Times New Roman" w:hAnsi="Times New Roman"/>
+          <w:sz w:val="22"/>
+          <w:szCs w:val="22"/>
+          <w:lang w:val="de-DE"/>
+        </w:rPr>
+      </w:pPr>
+      <w:r>
+        <w:rPr>
+          <w:rFonts w:ascii="Times New Roman" w:hAnsi="Times New Roman"/>
+          <w:b/>
+          <w:bCs/>
+          <w:sz w:val="22"/>
+          <w:szCs w:val="22"/>
+          <w:lang w:val="en-US"/>
+        </w:rPr>
+        <w:t xml:space="preserve">TV Sound: </w:t>
+      </w:r>
+      <w:hyperlink r:id="rId18" w:history="1">
+        <w:r>
+          <w:rPr>
+            <w:rStyle w:val="Hyperlink"/>
+            <w:rFonts w:ascii="Times New Roman" w:hAnsi="Times New Roman"/>
+            <w:sz w:val="22"/>
+            <w:szCs w:val="22"/>
+            <w:lang w:val="en-US"/>
+          </w:rPr>
+          <w:t>https://freesound.org/people/SergeQuadrado/sounds/468539/</w:t>
+        </w:r>
+      </w:hyperlink>
     </w:p>
     <w:sectPr>
       <w:pgSz w:w="11906" w:h="16838"/>
@@ -3124,14 +3170,14 @@
     <w:lsdException w:name="Unresolved Mention" w:semiHidden="1" w:unhideWhenUsed="1"/>
     <w:lsdException w:name="Smart Link" w:semiHidden="1" w:unhideWhenUsed="1"/>
   </w:latentStyles>
-  <w:style w:type="paragraph" w:default="1" w:styleId="Standard">
+  <w:style w:type="paragraph" w:default="1" w:styleId="Normal">
     <w:name w:val="Normal"/>
     <w:qFormat/>
     <w:rPr>
       <w:noProof/>
     </w:rPr>
   </w:style>
-  <w:style w:type="paragraph" w:styleId="berschrift1">
+  <w:style w:type="paragraph" w:styleId="Heading1">
     <w:name w:val="heading 1"/>
     <w:uiPriority w:val="9"/>
     <w:qFormat/>
@@ -3147,7 +3193,7 @@
       <w:szCs w:val="30"/>
     </w:rPr>
   </w:style>
-  <w:style w:type="paragraph" w:styleId="berschrift2">
+  <w:style w:type="paragraph" w:styleId="Heading2">
     <w:name w:val="heading 2"/>
     <w:uiPriority w:val="9"/>
     <w:unhideWhenUsed/>
@@ -3164,13 +3210,13 @@
       <w:szCs w:val="24"/>
     </w:rPr>
   </w:style>
-  <w:style w:type="character" w:default="1" w:styleId="Absatz-Standardschriftart">
+  <w:style w:type="character" w:default="1" w:styleId="DefaultParagraphFont">
     <w:name w:val="Default Paragraph Font"/>
     <w:uiPriority w:val="1"/>
     <w:semiHidden/>
     <w:unhideWhenUsed/>
   </w:style>
-  <w:style w:type="table" w:default="1" w:styleId="NormaleTabelle">
+  <w:style w:type="table" w:default="1" w:styleId="TableNormal">
     <w:name w:val="Normal Table"/>
     <w:uiPriority w:val="99"/>
     <w:semiHidden/>
@@ -3185,20 +3231,20 @@
       </w:tblCellMar>
     </w:tblPr>
   </w:style>
-  <w:style w:type="numbering" w:default="1" w:styleId="KeineListe">
+  <w:style w:type="numbering" w:default="1" w:styleId="NoList">
     <w:name w:val="No List"/>
     <w:uiPriority w:val="99"/>
     <w:semiHidden/>
     <w:unhideWhenUsed/>
   </w:style>
-  <w:style w:type="paragraph" w:styleId="Listenabsatz">
+  <w:style w:type="paragraph" w:styleId="ListParagraph">
     <w:name w:val="List Paragraph"/>
     <w:pPr>
       <w:spacing w:after="60"/>
       <w:ind w:left="284"/>
     </w:pPr>
   </w:style>
-  <w:style w:type="table" w:styleId="Tabellenraster">
+  <w:style w:type="table" w:styleId="TableGrid">
     <w:name w:val="Table Grid"/>
     <w:tblPr>
       <w:tblCellMar>
@@ -3211,7 +3257,7 @@
   </w:style>
   <w:style w:type="character" w:styleId="Hyperlink">
     <w:name w:val="Hyperlink"/>
-    <w:basedOn w:val="Absatz-Standardschriftart"/>
+    <w:basedOn w:val="DefaultParagraphFont"/>
     <w:uiPriority w:val="99"/>
     <w:unhideWhenUsed/>
     <w:rsid w:val="00442BF3"/>
@@ -3220,9 +3266,9 @@
       <w:u w:val="single"/>
     </w:rPr>
   </w:style>
-  <w:style w:type="character" w:styleId="NichtaufgelsteErwhnung">
+  <w:style w:type="character" w:styleId="UnresolvedMention">
     <w:name w:val="Unresolved Mention"/>
-    <w:basedOn w:val="Absatz-Standardschriftart"/>
+    <w:basedOn w:val="DefaultParagraphFont"/>
     <w:uiPriority w:val="99"/>
     <w:semiHidden/>
     <w:unhideWhenUsed/>
@@ -3230,6 +3276,18 @@
     <w:rPr>
       <w:color w:val="605E5C"/>
       <w:shd w:val="clear" w:color="auto" w:fill="E1DFDD"/>
+    </w:rPr>
+  </w:style>
+  <w:style w:type="character" w:styleId="FollowedHyperlink">
+    <w:name w:val="FollowedHyperlink"/>
+    <w:basedOn w:val="DefaultParagraphFont"/>
+    <w:uiPriority w:val="99"/>
+    <w:semiHidden/>
+    <w:unhideWhenUsed/>
+    <w:rsid w:val="00E61BF6"/>
+    <w:rPr>
+      <w:color w:val="96607D" w:themeColor="followedHyperlink"/>
+      <w:u w:val="single"/>
     </w:rPr>
   </w:style>
 </w:styles>

</xml_diff>